<commit_message>
Docs: restore the template's three Elements frames plus NOTES
The first cut replaced the tutor's whole Elements area with one screenshot,
losing the GRAPHICS / TEXT / AUDIO-VIDEO structure the template asks for.
Each screen now has all three frames - the screenshot under GRAPHICS, the
interface copy under TEXT, and an honest 'none, and why' under AUDIO/VIDEO -
followed by a NOTES box with the design reasoning. --shoot also re-takes the
screenshots so the document can be regenerated after the demo data changes.
</commit_message>
<xml_diff>
--- a/submission/storyboard-giving-coast.docx
+++ b/submission/storyboard-giving-coast.docx
@@ -47,45 +47,310 @@
         <w:t>Elements:</w:t>
       </w:r>
     </w:p>
-    <w:p>
-      <w:pPr>
-        <w:spacing w:after="120"/>
-        <w:jc w:val="center"/>
+    <w:tbl>
+      <w:tblPr>
+        <w:tblW w:type="auto" w:w="0"/>
+        <w:tblLook w:firstColumn="1" w:firstRow="1" w:lastColumn="0" w:lastRow="0" w:noHBand="0" w:noVBand="1" w:val="04A0"/>
+        <w:tblBorders>
+          <w:top w:val="single" w:sz="4" w:space="0" w:color="808080"/>
+          <w:left w:val="single" w:sz="4" w:space="0" w:color="808080"/>
+          <w:bottom w:val="single" w:sz="4" w:space="0" w:color="808080"/>
+          <w:right w:val="single" w:sz="4" w:space="0" w:color="808080"/>
+          <w:insideH w:val="single" w:sz="4" w:space="0" w:color="808080"/>
+          <w:insideV w:val="single" w:sz="4" w:space="0" w:color="808080"/>
+        </w:tblBorders>
+      </w:tblPr>
+      <w:tblGrid>
+        <w:gridCol w:w="9354"/>
+      </w:tblGrid>
+      <w:tr>
+        <w:tc>
+          <w:tcPr>
+            <w:tcW w:type="dxa" w:w="9354"/>
+          </w:tcPr>
+          <w:p>
+            <w:pPr>
+              <w:spacing w:after="40"/>
+            </w:pPr>
+            <w:r>
+              <w:rPr>
+                <w:rFonts w:ascii="Comic Sans MS" w:hAnsi="Comic Sans MS"/>
+                <w:b w:val="0"/>
+                <w:sz w:val="20"/>
+              </w:rPr>
+              <w:t>GRAPHICS:</w:t>
+            </w:r>
+          </w:p>
+          <w:p>
+            <w:pPr>
+              <w:spacing w:after="40"/>
+              <w:jc w:val="center"/>
+            </w:pPr>
+            <w:r>
+              <w:drawing>
+                <wp:inline xmlns:a="http://schemas.openxmlformats.org/drawingml/2006/main" xmlns:pic="http://schemas.openxmlformats.org/drawingml/2006/picture">
+                  <wp:extent cx="3780000" cy="3691406"/>
+                  <wp:docPr id="1" name="Picture 1"/>
+                  <wp:cNvGraphicFramePr>
+                    <a:graphicFrameLocks noChangeAspect="1"/>
+                  </wp:cNvGraphicFramePr>
+                  <a:graphic>
+                    <a:graphicData uri="http://schemas.openxmlformats.org/drawingml/2006/picture">
+                      <pic:pic>
+                        <pic:nvPicPr>
+                          <pic:cNvPr id="0" name="S1-home.png"/>
+                          <pic:cNvPicPr/>
+                        </pic:nvPicPr>
+                        <pic:blipFill>
+                          <a:blip r:embed="rId7"/>
+                          <a:stretch>
+                            <a:fillRect/>
+                          </a:stretch>
+                        </pic:blipFill>
+                        <pic:spPr>
+                          <a:xfrm>
+                            <a:off x="0" y="0"/>
+                            <a:ext cx="3780000" cy="3691406"/>
+                          </a:xfrm>
+                          <a:prstGeom prst="rect"/>
+                        </pic:spPr>
+                      </pic:pic>
+                    </a:graphicData>
+                  </a:graphic>
+                </wp:inline>
+              </w:drawing>
+            </w:r>
+          </w:p>
+          <w:p>
+            <w:pPr>
+              <w:spacing w:after="0"/>
+            </w:pPr>
+            <w:r>
+              <w:rPr>
+                <w:rFonts w:ascii="Comic Sans MS" w:hAnsi="Comic Sans MS"/>
+                <w:sz w:val="18"/>
+              </w:rPr>
+              <w:t>Live screenshot of the deployed page (https://24831941.it.scu.edu.au), taken with headless Chrome. The layout is the design; every value on it comes from the API.</w:t>
+            </w:r>
+          </w:p>
+        </w:tc>
+      </w:tr>
+    </w:tbl>
+    <w:p>
+      <w:pPr>
+        <w:spacing w:after="0"/>
+      </w:pPr>
+    </w:p>
+    <w:tbl>
+      <w:tblPr>
+        <w:tblW w:type="auto" w:w="0"/>
+        <w:tblLook w:firstColumn="1" w:firstRow="1" w:lastColumn="0" w:lastRow="0" w:noHBand="0" w:noVBand="1" w:val="04A0"/>
+        <w:tblBorders>
+          <w:top w:val="single" w:sz="4" w:space="0" w:color="808080"/>
+          <w:left w:val="single" w:sz="4" w:space="0" w:color="808080"/>
+          <w:bottom w:val="single" w:sz="4" w:space="0" w:color="808080"/>
+          <w:right w:val="single" w:sz="4" w:space="0" w:color="808080"/>
+          <w:insideH w:val="single" w:sz="4" w:space="0" w:color="808080"/>
+          <w:insideV w:val="single" w:sz="4" w:space="0" w:color="808080"/>
+        </w:tblBorders>
+      </w:tblPr>
+      <w:tblGrid>
+        <w:gridCol w:w="9354"/>
+      </w:tblGrid>
+      <w:tr>
+        <w:tc>
+          <w:tcPr>
+            <w:tcW w:type="dxa" w:w="9354"/>
+          </w:tcPr>
+          <w:p>
+            <w:pPr>
+              <w:spacing w:after="40"/>
+            </w:pPr>
+            <w:r>
+              <w:rPr>
+                <w:rFonts w:ascii="Comic Sans MS" w:hAnsi="Comic Sans MS"/>
+                <w:b w:val="0"/>
+                <w:sz w:val="20"/>
+              </w:rPr>
+              <w:t>TEXT:</w:t>
+            </w:r>
+          </w:p>
+          <w:p>
+            <w:pPr>
+              <w:spacing w:after="0"/>
+            </w:pPr>
+            <w:r>
+              <w:rPr>
+                <w:rFonts w:ascii="Comic Sans MS" w:hAnsi="Comic Sans MS"/>
+                <w:sz w:val="18"/>
+              </w:rPr>
+              <w:t>Hero: eyebrow 'Gold Coast - Queensland', headline 'Charity events worth showing up for', lead paragraph</w:t>
+            </w:r>
+          </w:p>
+          <w:p>
+            <w:pPr>
+              <w:spacing w:after="0"/>
+            </w:pPr>
+            <w:r>
+              <w:rPr>
+                <w:rFonts w:ascii="Comic Sans MS" w:hAnsi="Comic Sans MS"/>
+                <w:sz w:val="18"/>
+              </w:rPr>
+              <w:t>Button: 'Find an event'</w:t>
+            </w:r>
+          </w:p>
+          <w:p>
+            <w:pPr>
+              <w:spacing w:after="0"/>
+            </w:pPr>
+            <w:r>
+              <w:rPr>
+                <w:rFonts w:ascii="Comic Sans MS" w:hAnsi="Comic Sans MS"/>
+                <w:sz w:val="18"/>
+              </w:rPr>
+              <w:t>Section headings: 'Upcoming events' / 'Recently finished'</w:t>
+            </w:r>
+          </w:p>
+          <w:p>
+            <w:pPr>
+              <w:spacing w:after="0"/>
+            </w:pPr>
+            <w:r>
+              <w:rPr>
+                <w:rFonts w:ascii="Comic Sans MS" w:hAnsi="Comic Sans MS"/>
+                <w:sz w:val="18"/>
+              </w:rPr>
+              <w:t>On every card: event name, date, time, venue, price, one-line summary, '$X raised of $Y goal', 'N registered', charity name</w:t>
+            </w:r>
+          </w:p>
+        </w:tc>
+      </w:tr>
+    </w:tbl>
+    <w:p>
+      <w:pPr>
+        <w:spacing w:after="0"/>
+      </w:pPr>
+    </w:p>
+    <w:tbl>
+      <w:tblPr>
+        <w:tblW w:type="auto" w:w="0"/>
+        <w:tblLook w:firstColumn="1" w:firstRow="1" w:lastColumn="0" w:lastRow="0" w:noHBand="0" w:noVBand="1" w:val="04A0"/>
+        <w:tblBorders>
+          <w:top w:val="single" w:sz="4" w:space="0" w:color="808080"/>
+          <w:left w:val="single" w:sz="4" w:space="0" w:color="808080"/>
+          <w:bottom w:val="single" w:sz="4" w:space="0" w:color="808080"/>
+          <w:right w:val="single" w:sz="4" w:space="0" w:color="808080"/>
+          <w:insideH w:val="single" w:sz="4" w:space="0" w:color="808080"/>
+          <w:insideV w:val="single" w:sz="4" w:space="0" w:color="808080"/>
+        </w:tblBorders>
+      </w:tblPr>
+      <w:tblGrid>
+        <w:gridCol w:w="9354"/>
+      </w:tblGrid>
+      <w:tr>
+        <w:tc>
+          <w:tcPr>
+            <w:tcW w:type="dxa" w:w="9354"/>
+          </w:tcPr>
+          <w:p>
+            <w:pPr>
+              <w:spacing w:after="40"/>
+            </w:pPr>
+            <w:r>
+              <w:rPr>
+                <w:rFonts w:ascii="Comic Sans MS" w:hAnsi="Comic Sans MS"/>
+                <w:b w:val="0"/>
+                <w:sz w:val="20"/>
+              </w:rPr>
+              <w:t>AUDIO/VIDEO:</w:t>
+            </w:r>
+          </w:p>
+          <w:p>
+            <w:pPr>
+              <w:spacing w:after="0"/>
+            </w:pPr>
+            <w:r>
+              <w:rPr>
+                <w:rFonts w:ascii="Comic Sans MS" w:hAnsi="Comic Sans MS"/>
+                <w:sz w:val="18"/>
+              </w:rPr>
+              <w:t>None. No audio, no video, no images: the icons are characters from the database, the colour bands and progress bar are CSS drawn from API values.</w:t>
+            </w:r>
+          </w:p>
+        </w:tc>
+      </w:tr>
+    </w:tbl>
+    <w:p>
+      <w:pPr>
+        <w:spacing w:after="0"/>
+      </w:pPr>
+    </w:p>
+    <w:p>
+      <w:pPr>
+        <w:spacing w:after="40"/>
       </w:pPr>
       <w:r>
-        <w:drawing>
-          <wp:inline xmlns:a="http://schemas.openxmlformats.org/drawingml/2006/main" xmlns:pic="http://schemas.openxmlformats.org/drawingml/2006/picture">
-            <wp:extent cx="4500000" cy="4394531"/>
-            <wp:docPr id="1" name="Picture 1"/>
-            <wp:cNvGraphicFramePr>
-              <a:graphicFrameLocks noChangeAspect="1"/>
-            </wp:cNvGraphicFramePr>
-            <a:graphic>
-              <a:graphicData uri="http://schemas.openxmlformats.org/drawingml/2006/picture">
-                <pic:pic>
-                  <pic:nvPicPr>
-                    <pic:cNvPr id="0" name="S1-home.png"/>
-                    <pic:cNvPicPr/>
-                  </pic:nvPicPr>
-                  <pic:blipFill>
-                    <a:blip r:embed="rId7"/>
-                    <a:stretch>
-                      <a:fillRect/>
-                    </a:stretch>
-                  </pic:blipFill>
-                  <pic:spPr>
-                    <a:xfrm>
-                      <a:off x="0" y="0"/>
-                      <a:ext cx="4500000" cy="4394531"/>
-                    </a:xfrm>
-                    <a:prstGeom prst="rect"/>
-                  </pic:spPr>
-                </pic:pic>
-              </a:graphicData>
-            </a:graphic>
-          </wp:inline>
-        </w:drawing>
+        <w:rPr>
+          <w:rFonts w:ascii="Comic Sans MS" w:hAnsi="Comic Sans MS" w:cs="Comic Sans MS"/>
+          <w:b/>
+          <w:sz w:val="28"/>
+        </w:rPr>
+        <w:t>NOTES</w:t>
       </w:r>
+    </w:p>
+    <w:tbl>
+      <w:tblPr>
+        <w:tblW w:type="auto" w:w="0"/>
+        <w:tblLook w:firstColumn="1" w:firstRow="1" w:lastColumn="0" w:lastRow="0" w:noHBand="0" w:noVBand="1" w:val="04A0"/>
+        <w:tblBorders>
+          <w:top w:val="single" w:sz="4" w:space="0" w:color="808080"/>
+          <w:left w:val="single" w:sz="4" w:space="0" w:color="808080"/>
+          <w:bottom w:val="single" w:sz="4" w:space="0" w:color="808080"/>
+          <w:right w:val="single" w:sz="4" w:space="0" w:color="808080"/>
+          <w:insideH w:val="single" w:sz="4" w:space="0" w:color="808080"/>
+          <w:insideV w:val="single" w:sz="4" w:space="0" w:color="808080"/>
+        </w:tblBorders>
+      </w:tblPr>
+      <w:tblGrid>
+        <w:gridCol w:w="9354"/>
+      </w:tblGrid>
+      <w:tr>
+        <w:tc>
+          <w:tcPr>
+            <w:tcW w:type="dxa" w:w="9354"/>
+          </w:tcPr>
+          <w:p>
+            <w:pPr>
+              <w:spacing w:after="40"/>
+            </w:pPr>
+            <w:r>
+              <w:rPr>
+                <w:rFonts w:ascii="Comic Sans MS" w:hAnsi="Comic Sans MS"/>
+                <w:b w:val="0"/>
+                <w:sz w:val="20"/>
+              </w:rPr>
+              <w:t>NOTES:</w:t>
+            </w:r>
+          </w:p>
+          <w:p>
+            <w:pPr>
+              <w:spacing w:after="0"/>
+            </w:pPr>
+            <w:r>
+              <w:rPr>
+                <w:rFonts w:ascii="Comic Sans MS" w:hAnsi="Comic Sans MS"/>
+                <w:sz w:val="18"/>
+              </w:rPr>
+              <w:t>The first screen is already the product: a visitor reaches an event in at most one click, and a broken back end shows immediately as an empty grid with a retry button rather than a silent blank page.</w:t>
+            </w:r>
+          </w:p>
+        </w:tc>
+      </w:tr>
+    </w:tbl>
+    <w:p>
+      <w:pPr>
+        <w:spacing w:after="0"/>
+      </w:pPr>
     </w:p>
     <w:tbl>
       <w:tblPr>
@@ -324,45 +589,322 @@
         <w:t>Elements:</w:t>
       </w:r>
     </w:p>
-    <w:p>
-      <w:pPr>
-        <w:spacing w:after="120"/>
-        <w:jc w:val="center"/>
+    <w:tbl>
+      <w:tblPr>
+        <w:tblW w:type="auto" w:w="0"/>
+        <w:tblLook w:firstColumn="1" w:firstRow="1" w:lastColumn="0" w:lastRow="0" w:noHBand="0" w:noVBand="1" w:val="04A0"/>
+        <w:tblBorders>
+          <w:top w:val="single" w:sz="4" w:space="0" w:color="808080"/>
+          <w:left w:val="single" w:sz="4" w:space="0" w:color="808080"/>
+          <w:bottom w:val="single" w:sz="4" w:space="0" w:color="808080"/>
+          <w:right w:val="single" w:sz="4" w:space="0" w:color="808080"/>
+          <w:insideH w:val="single" w:sz="4" w:space="0" w:color="808080"/>
+          <w:insideV w:val="single" w:sz="4" w:space="0" w:color="808080"/>
+        </w:tblBorders>
+      </w:tblPr>
+      <w:tblGrid>
+        <w:gridCol w:w="9354"/>
+      </w:tblGrid>
+      <w:tr>
+        <w:tc>
+          <w:tcPr>
+            <w:tcW w:type="dxa" w:w="9354"/>
+          </w:tcPr>
+          <w:p>
+            <w:pPr>
+              <w:spacing w:after="40"/>
+            </w:pPr>
+            <w:r>
+              <w:rPr>
+                <w:rFonts w:ascii="Comic Sans MS" w:hAnsi="Comic Sans MS"/>
+                <w:b w:val="0"/>
+                <w:sz w:val="20"/>
+              </w:rPr>
+              <w:t>GRAPHICS:</w:t>
+            </w:r>
+          </w:p>
+          <w:p>
+            <w:pPr>
+              <w:spacing w:after="40"/>
+              <w:jc w:val="center"/>
+            </w:pPr>
+            <w:r>
+              <w:drawing>
+                <wp:inline xmlns:a="http://schemas.openxmlformats.org/drawingml/2006/main" xmlns:pic="http://schemas.openxmlformats.org/drawingml/2006/picture">
+                  <wp:extent cx="3780000" cy="3691406"/>
+                  <wp:docPr id="2" name="Picture 2"/>
+                  <wp:cNvGraphicFramePr>
+                    <a:graphicFrameLocks noChangeAspect="1"/>
+                  </wp:cNvGraphicFramePr>
+                  <a:graphic>
+                    <a:graphicData uri="http://schemas.openxmlformats.org/drawingml/2006/picture">
+                      <pic:pic>
+                        <pic:nvPicPr>
+                          <pic:cNvPr id="0" name="S2-search.png"/>
+                          <pic:cNvPicPr/>
+                        </pic:nvPicPr>
+                        <pic:blipFill>
+                          <a:blip r:embed="rId8"/>
+                          <a:stretch>
+                            <a:fillRect/>
+                          </a:stretch>
+                        </pic:blipFill>
+                        <pic:spPr>
+                          <a:xfrm>
+                            <a:off x="0" y="0"/>
+                            <a:ext cx="3780000" cy="3691406"/>
+                          </a:xfrm>
+                          <a:prstGeom prst="rect"/>
+                        </pic:spPr>
+                      </pic:pic>
+                    </a:graphicData>
+                  </a:graphic>
+                </wp:inline>
+              </w:drawing>
+            </w:r>
+          </w:p>
+          <w:p>
+            <w:pPr>
+              <w:spacing w:after="0"/>
+            </w:pPr>
+            <w:r>
+              <w:rPr>
+                <w:rFonts w:ascii="Comic Sans MS" w:hAnsi="Comic Sans MS"/>
+                <w:sz w:val="18"/>
+              </w:rPr>
+              <w:t>Live screenshot of the deployed page (https://24831941.it.scu.edu.au), taken with headless Chrome. The layout is the design; every value on it comes from the API.</w:t>
+            </w:r>
+          </w:p>
+        </w:tc>
+      </w:tr>
+    </w:tbl>
+    <w:p>
+      <w:pPr>
+        <w:spacing w:after="0"/>
+      </w:pPr>
+    </w:p>
+    <w:tbl>
+      <w:tblPr>
+        <w:tblW w:type="auto" w:w="0"/>
+        <w:tblLook w:firstColumn="1" w:firstRow="1" w:lastColumn="0" w:lastRow="0" w:noHBand="0" w:noVBand="1" w:val="04A0"/>
+        <w:tblBorders>
+          <w:top w:val="single" w:sz="4" w:space="0" w:color="808080"/>
+          <w:left w:val="single" w:sz="4" w:space="0" w:color="808080"/>
+          <w:bottom w:val="single" w:sz="4" w:space="0" w:color="808080"/>
+          <w:right w:val="single" w:sz="4" w:space="0" w:color="808080"/>
+          <w:insideH w:val="single" w:sz="4" w:space="0" w:color="808080"/>
+          <w:insideV w:val="single" w:sz="4" w:space="0" w:color="808080"/>
+        </w:tblBorders>
+      </w:tblPr>
+      <w:tblGrid>
+        <w:gridCol w:w="9354"/>
+      </w:tblGrid>
+      <w:tr>
+        <w:tc>
+          <w:tcPr>
+            <w:tcW w:type="dxa" w:w="9354"/>
+          </w:tcPr>
+          <w:p>
+            <w:pPr>
+              <w:spacing w:after="40"/>
+            </w:pPr>
+            <w:r>
+              <w:rPr>
+                <w:rFonts w:ascii="Comic Sans MS" w:hAnsi="Comic Sans MS"/>
+                <w:b w:val="0"/>
+                <w:sz w:val="20"/>
+              </w:rPr>
+              <w:t>TEXT:</w:t>
+            </w:r>
+          </w:p>
+          <w:p>
+            <w:pPr>
+              <w:spacing w:after="0"/>
+            </w:pPr>
+            <w:r>
+              <w:rPr>
+                <w:rFonts w:ascii="Comic Sans MS" w:hAnsi="Comic Sans MS"/>
+                <w:sz w:val="18"/>
+              </w:rPr>
+              <w:t>Title: 'Search events'</w:t>
+            </w:r>
+          </w:p>
+          <w:p>
+            <w:pPr>
+              <w:spacing w:after="0"/>
+            </w:pPr>
+            <w:r>
+              <w:rPr>
+                <w:rFonts w:ascii="Comic Sans MS" w:hAnsi="Comic Sans MS"/>
+                <w:sz w:val="18"/>
+              </w:rPr>
+              <w:t>Instruction: 'Leave everything blank to see everything that is still coming up.'</w:t>
+            </w:r>
+          </w:p>
+          <w:p>
+            <w:pPr>
+              <w:spacing w:after="0"/>
+            </w:pPr>
+            <w:r>
+              <w:rPr>
+                <w:rFonts w:ascii="Comic Sans MS" w:hAnsi="Comic Sans MS"/>
+                <w:sz w:val="18"/>
+              </w:rPr>
+              <w:t>Field labels: Date / Location / Category</w:t>
+            </w:r>
+          </w:p>
+          <w:p>
+            <w:pPr>
+              <w:spacing w:after="0"/>
+            </w:pPr>
+            <w:r>
+              <w:rPr>
+                <w:rFonts w:ascii="Comic Sans MS" w:hAnsi="Comic Sans MS"/>
+                <w:sz w:val="18"/>
+              </w:rPr>
+              <w:t>Buttons: 'Search' / 'Clear'</w:t>
+            </w:r>
+          </w:p>
+          <w:p>
+            <w:pPr>
+              <w:spacing w:after="0"/>
+            </w:pPr>
+            <w:r>
+              <w:rPr>
+                <w:rFonts w:ascii="Comic Sans MS" w:hAnsi="Comic Sans MS"/>
+                <w:sz w:val="18"/>
+              </w:rPr>
+              <w:t>Results heading with the number found</w:t>
+            </w:r>
+          </w:p>
+        </w:tc>
+      </w:tr>
+    </w:tbl>
+    <w:p>
+      <w:pPr>
+        <w:spacing w:after="0"/>
+      </w:pPr>
+    </w:p>
+    <w:tbl>
+      <w:tblPr>
+        <w:tblW w:type="auto" w:w="0"/>
+        <w:tblLook w:firstColumn="1" w:firstRow="1" w:lastColumn="0" w:lastRow="0" w:noHBand="0" w:noVBand="1" w:val="04A0"/>
+        <w:tblBorders>
+          <w:top w:val="single" w:sz="4" w:space="0" w:color="808080"/>
+          <w:left w:val="single" w:sz="4" w:space="0" w:color="808080"/>
+          <w:bottom w:val="single" w:sz="4" w:space="0" w:color="808080"/>
+          <w:right w:val="single" w:sz="4" w:space="0" w:color="808080"/>
+          <w:insideH w:val="single" w:sz="4" w:space="0" w:color="808080"/>
+          <w:insideV w:val="single" w:sz="4" w:space="0" w:color="808080"/>
+        </w:tblBorders>
+      </w:tblPr>
+      <w:tblGrid>
+        <w:gridCol w:w="9354"/>
+      </w:tblGrid>
+      <w:tr>
+        <w:tc>
+          <w:tcPr>
+            <w:tcW w:type="dxa" w:w="9354"/>
+          </w:tcPr>
+          <w:p>
+            <w:pPr>
+              <w:spacing w:after="40"/>
+            </w:pPr>
+            <w:r>
+              <w:rPr>
+                <w:rFonts w:ascii="Comic Sans MS" w:hAnsi="Comic Sans MS"/>
+                <w:b w:val="0"/>
+                <w:sz w:val="20"/>
+              </w:rPr>
+              <w:t>AUDIO/VIDEO:</w:t>
+            </w:r>
+          </w:p>
+          <w:p>
+            <w:pPr>
+              <w:spacing w:after="0"/>
+            </w:pPr>
+            <w:r>
+              <w:rPr>
+                <w:rFonts w:ascii="Comic Sans MS" w:hAnsi="Comic Sans MS"/>
+                <w:sz w:val="18"/>
+              </w:rPr>
+              <w:t>None - same card component as the home page; the category icons come from the database.</w:t>
+            </w:r>
+          </w:p>
+        </w:tc>
+      </w:tr>
+    </w:tbl>
+    <w:p>
+      <w:pPr>
+        <w:spacing w:after="0"/>
+      </w:pPr>
+    </w:p>
+    <w:p>
+      <w:pPr>
+        <w:spacing w:after="40"/>
       </w:pPr>
       <w:r>
-        <w:drawing>
-          <wp:inline xmlns:a="http://schemas.openxmlformats.org/drawingml/2006/main" xmlns:pic="http://schemas.openxmlformats.org/drawingml/2006/picture">
-            <wp:extent cx="4500000" cy="4394531"/>
-            <wp:docPr id="2" name="Picture 2"/>
-            <wp:cNvGraphicFramePr>
-              <a:graphicFrameLocks noChangeAspect="1"/>
-            </wp:cNvGraphicFramePr>
-            <a:graphic>
-              <a:graphicData uri="http://schemas.openxmlformats.org/drawingml/2006/picture">
-                <pic:pic>
-                  <pic:nvPicPr>
-                    <pic:cNvPr id="0" name="S2-search.png"/>
-                    <pic:cNvPicPr/>
-                  </pic:nvPicPr>
-                  <pic:blipFill>
-                    <a:blip r:embed="rId8"/>
-                    <a:stretch>
-                      <a:fillRect/>
-                    </a:stretch>
-                  </pic:blipFill>
-                  <pic:spPr>
-                    <a:xfrm>
-                      <a:off x="0" y="0"/>
-                      <a:ext cx="4500000" cy="4394531"/>
-                    </a:xfrm>
-                    <a:prstGeom prst="rect"/>
-                  </pic:spPr>
-                </pic:pic>
-              </a:graphicData>
-            </a:graphic>
-          </wp:inline>
-        </w:drawing>
+        <w:rPr>
+          <w:rFonts w:ascii="Comic Sans MS" w:hAnsi="Comic Sans MS" w:cs="Comic Sans MS"/>
+          <w:b/>
+          <w:sz w:val="28"/>
+        </w:rPr>
+        <w:t>NOTES</w:t>
       </w:r>
+    </w:p>
+    <w:tbl>
+      <w:tblPr>
+        <w:tblW w:type="auto" w:w="0"/>
+        <w:tblLook w:firstColumn="1" w:firstRow="1" w:lastColumn="0" w:lastRow="0" w:noHBand="0" w:noVBand="1" w:val="04A0"/>
+        <w:tblBorders>
+          <w:top w:val="single" w:sz="4" w:space="0" w:color="808080"/>
+          <w:left w:val="single" w:sz="4" w:space="0" w:color="808080"/>
+          <w:bottom w:val="single" w:sz="4" w:space="0" w:color="808080"/>
+          <w:right w:val="single" w:sz="4" w:space="0" w:color="808080"/>
+          <w:insideH w:val="single" w:sz="4" w:space="0" w:color="808080"/>
+          <w:insideV w:val="single" w:sz="4" w:space="0" w:color="808080"/>
+        </w:tblBorders>
+      </w:tblPr>
+      <w:tblGrid>
+        <w:gridCol w:w="9354"/>
+      </w:tblGrid>
+      <w:tr>
+        <w:tc>
+          <w:tcPr>
+            <w:tcW w:type="dxa" w:w="9354"/>
+          </w:tcPr>
+          <w:p>
+            <w:pPr>
+              <w:spacing w:after="40"/>
+            </w:pPr>
+            <w:r>
+              <w:rPr>
+                <w:rFonts w:ascii="Comic Sans MS" w:hAnsi="Comic Sans MS"/>
+                <w:b w:val="0"/>
+                <w:sz w:val="20"/>
+              </w:rPr>
+              <w:t>NOTES:</w:t>
+            </w:r>
+          </w:p>
+          <w:p>
+            <w:pPr>
+              <w:spacing w:after="0"/>
+            </w:pPr>
+            <w:r>
+              <w:rPr>
+                <w:rFonts w:ascii="Comic Sans MS" w:hAnsi="Comic Sans MS"/>
+                <w:sz w:val="18"/>
+              </w:rPr>
+              <w:t>Filtering runs on the server, so the page only draws results; 'no search yet' and 'no results' are deliberately two different states. A past date is refused before the request is sent.</w:t>
+            </w:r>
+          </w:p>
+        </w:tc>
+      </w:tr>
+    </w:tbl>
+    <w:p>
+      <w:pPr>
+        <w:spacing w:after="0"/>
+      </w:pPr>
     </w:p>
     <w:tbl>
       <w:tblPr>
@@ -597,45 +1139,298 @@
         <w:t>Elements:</w:t>
       </w:r>
     </w:p>
-    <w:p>
-      <w:pPr>
-        <w:spacing w:after="120"/>
-        <w:jc w:val="center"/>
+    <w:tbl>
+      <w:tblPr>
+        <w:tblW w:type="auto" w:w="0"/>
+        <w:tblLook w:firstColumn="1" w:firstRow="1" w:lastColumn="0" w:lastRow="0" w:noHBand="0" w:noVBand="1" w:val="04A0"/>
+        <w:tblBorders>
+          <w:top w:val="single" w:sz="4" w:space="0" w:color="808080"/>
+          <w:left w:val="single" w:sz="4" w:space="0" w:color="808080"/>
+          <w:bottom w:val="single" w:sz="4" w:space="0" w:color="808080"/>
+          <w:right w:val="single" w:sz="4" w:space="0" w:color="808080"/>
+          <w:insideH w:val="single" w:sz="4" w:space="0" w:color="808080"/>
+          <w:insideV w:val="single" w:sz="4" w:space="0" w:color="808080"/>
+        </w:tblBorders>
+      </w:tblPr>
+      <w:tblGrid>
+        <w:gridCol w:w="9354"/>
+      </w:tblGrid>
+      <w:tr>
+        <w:tc>
+          <w:tcPr>
+            <w:tcW w:type="dxa" w:w="9354"/>
+          </w:tcPr>
+          <w:p>
+            <w:pPr>
+              <w:spacing w:after="40"/>
+            </w:pPr>
+            <w:r>
+              <w:rPr>
+                <w:rFonts w:ascii="Comic Sans MS" w:hAnsi="Comic Sans MS"/>
+                <w:b w:val="0"/>
+                <w:sz w:val="20"/>
+              </w:rPr>
+              <w:t>GRAPHICS:</w:t>
+            </w:r>
+          </w:p>
+          <w:p>
+            <w:pPr>
+              <w:spacing w:after="40"/>
+              <w:jc w:val="center"/>
+            </w:pPr>
+            <w:r>
+              <w:drawing>
+                <wp:inline xmlns:a="http://schemas.openxmlformats.org/drawingml/2006/main" xmlns:pic="http://schemas.openxmlformats.org/drawingml/2006/picture">
+                  <wp:extent cx="3780000" cy="3691406"/>
+                  <wp:docPr id="3" name="Picture 3"/>
+                  <wp:cNvGraphicFramePr>
+                    <a:graphicFrameLocks noChangeAspect="1"/>
+                  </wp:cNvGraphicFramePr>
+                  <a:graphic>
+                    <a:graphicData uri="http://schemas.openxmlformats.org/drawingml/2006/picture">
+                      <pic:pic>
+                        <pic:nvPicPr>
+                          <pic:cNvPr id="0" name="S3-detail.png"/>
+                          <pic:cNvPicPr/>
+                        </pic:nvPicPr>
+                        <pic:blipFill>
+                          <a:blip r:embed="rId9"/>
+                          <a:stretch>
+                            <a:fillRect/>
+                          </a:stretch>
+                        </pic:blipFill>
+                        <pic:spPr>
+                          <a:xfrm>
+                            <a:off x="0" y="0"/>
+                            <a:ext cx="3780000" cy="3691406"/>
+                          </a:xfrm>
+                          <a:prstGeom prst="rect"/>
+                        </pic:spPr>
+                      </pic:pic>
+                    </a:graphicData>
+                  </a:graphic>
+                </wp:inline>
+              </w:drawing>
+            </w:r>
+          </w:p>
+          <w:p>
+            <w:pPr>
+              <w:spacing w:after="0"/>
+            </w:pPr>
+            <w:r>
+              <w:rPr>
+                <w:rFonts w:ascii="Comic Sans MS" w:hAnsi="Comic Sans MS"/>
+                <w:sz w:val="18"/>
+              </w:rPr>
+              <w:t>Live screenshot of the deployed page (https://24831941.it.scu.edu.au), taken with headless Chrome. The layout is the design; every value on it comes from the API.</w:t>
+            </w:r>
+          </w:p>
+        </w:tc>
+      </w:tr>
+    </w:tbl>
+    <w:p>
+      <w:pPr>
+        <w:spacing w:after="0"/>
+      </w:pPr>
+    </w:p>
+    <w:tbl>
+      <w:tblPr>
+        <w:tblW w:type="auto" w:w="0"/>
+        <w:tblLook w:firstColumn="1" w:firstRow="1" w:lastColumn="0" w:lastRow="0" w:noHBand="0" w:noVBand="1" w:val="04A0"/>
+        <w:tblBorders>
+          <w:top w:val="single" w:sz="4" w:space="0" w:color="808080"/>
+          <w:left w:val="single" w:sz="4" w:space="0" w:color="808080"/>
+          <w:bottom w:val="single" w:sz="4" w:space="0" w:color="808080"/>
+          <w:right w:val="single" w:sz="4" w:space="0" w:color="808080"/>
+          <w:insideH w:val="single" w:sz="4" w:space="0" w:color="808080"/>
+          <w:insideV w:val="single" w:sz="4" w:space="0" w:color="808080"/>
+        </w:tblBorders>
+      </w:tblPr>
+      <w:tblGrid>
+        <w:gridCol w:w="9354"/>
+      </w:tblGrid>
+      <w:tr>
+        <w:tc>
+          <w:tcPr>
+            <w:tcW w:type="dxa" w:w="9354"/>
+          </w:tcPr>
+          <w:p>
+            <w:pPr>
+              <w:spacing w:after="40"/>
+            </w:pPr>
+            <w:r>
+              <w:rPr>
+                <w:rFonts w:ascii="Comic Sans MS" w:hAnsi="Comic Sans MS"/>
+                <w:b w:val="0"/>
+                <w:sz w:val="20"/>
+              </w:rPr>
+              <w:t>TEXT:</w:t>
+            </w:r>
+          </w:p>
+          <w:p>
+            <w:pPr>
+              <w:spacing w:after="0"/>
+            </w:pPr>
+            <w:r>
+              <w:rPr>
+                <w:rFonts w:ascii="Comic Sans MS" w:hAnsi="Comic Sans MS"/>
+                <w:sz w:val="18"/>
+              </w:rPr>
+              <w:t>Breadcrumb: 'All events &gt; {category}' and a 'Back to all events' link</w:t>
+            </w:r>
+          </w:p>
+          <w:p>
+            <w:pPr>
+              <w:spacing w:after="0"/>
+            </w:pPr>
+            <w:r>
+              <w:rPr>
+                <w:rFonts w:ascii="Comic Sans MS" w:hAnsi="Comic Sans MS"/>
+                <w:sz w:val="18"/>
+              </w:rPr>
+              <w:t>Panels: 'Who is going' (name, tickets, booking date), 'Expected weather' (icon, description, max/min degrees), 'Run by' (charity details)</w:t>
+            </w:r>
+          </w:p>
+          <w:p>
+            <w:pPr>
+              <w:spacing w:after="0"/>
+            </w:pPr>
+            <w:r>
+              <w:rPr>
+                <w:rFonts w:ascii="Comic Sans MS" w:hAnsi="Comic Sans MS"/>
+                <w:sz w:val="18"/>
+              </w:rPr>
+              <w:t>Button: 'Register'</w:t>
+            </w:r>
+          </w:p>
+        </w:tc>
+      </w:tr>
+    </w:tbl>
+    <w:p>
+      <w:pPr>
+        <w:spacing w:after="0"/>
+      </w:pPr>
+    </w:p>
+    <w:tbl>
+      <w:tblPr>
+        <w:tblW w:type="auto" w:w="0"/>
+        <w:tblLook w:firstColumn="1" w:firstRow="1" w:lastColumn="0" w:lastRow="0" w:noHBand="0" w:noVBand="1" w:val="04A0"/>
+        <w:tblBorders>
+          <w:top w:val="single" w:sz="4" w:space="0" w:color="808080"/>
+          <w:left w:val="single" w:sz="4" w:space="0" w:color="808080"/>
+          <w:bottom w:val="single" w:sz="4" w:space="0" w:color="808080"/>
+          <w:right w:val="single" w:sz="4" w:space="0" w:color="808080"/>
+          <w:insideH w:val="single" w:sz="4" w:space="0" w:color="808080"/>
+          <w:insideV w:val="single" w:sz="4" w:space="0" w:color="808080"/>
+        </w:tblBorders>
+      </w:tblPr>
+      <w:tblGrid>
+        <w:gridCol w:w="9354"/>
+      </w:tblGrid>
+      <w:tr>
+        <w:tc>
+          <w:tcPr>
+            <w:tcW w:type="dxa" w:w="9354"/>
+          </w:tcPr>
+          <w:p>
+            <w:pPr>
+              <w:spacing w:after="40"/>
+            </w:pPr>
+            <w:r>
+              <w:rPr>
+                <w:rFonts w:ascii="Comic Sans MS" w:hAnsi="Comic Sans MS"/>
+                <w:b w:val="0"/>
+                <w:sz w:val="20"/>
+              </w:rPr>
+              <w:t>AUDIO/VIDEO:</w:t>
+            </w:r>
+          </w:p>
+          <w:p>
+            <w:pPr>
+              <w:spacing w:after="0"/>
+            </w:pPr>
+            <w:r>
+              <w:rPr>
+                <w:rFonts w:ascii="Comic Sans MS" w:hAnsi="Comic Sans MS"/>
+                <w:sz w:val="18"/>
+              </w:rPr>
+              <w:t>None. The weather icon is a character (emoji) mapped from the Open-Meteo numeric code by our own API, not an image file.</w:t>
+            </w:r>
+          </w:p>
+        </w:tc>
+      </w:tr>
+    </w:tbl>
+    <w:p>
+      <w:pPr>
+        <w:spacing w:after="0"/>
+      </w:pPr>
+    </w:p>
+    <w:p>
+      <w:pPr>
+        <w:spacing w:after="40"/>
       </w:pPr>
       <w:r>
-        <w:drawing>
-          <wp:inline xmlns:a="http://schemas.openxmlformats.org/drawingml/2006/main" xmlns:pic="http://schemas.openxmlformats.org/drawingml/2006/picture">
-            <wp:extent cx="4500000" cy="4394531"/>
-            <wp:docPr id="3" name="Picture 3"/>
-            <wp:cNvGraphicFramePr>
-              <a:graphicFrameLocks noChangeAspect="1"/>
-            </wp:cNvGraphicFramePr>
-            <a:graphic>
-              <a:graphicData uri="http://schemas.openxmlformats.org/drawingml/2006/picture">
-                <pic:pic>
-                  <pic:nvPicPr>
-                    <pic:cNvPr id="0" name="S3-detail.png"/>
-                    <pic:cNvPicPr/>
-                  </pic:nvPicPr>
-                  <pic:blipFill>
-                    <a:blip r:embed="rId9"/>
-                    <a:stretch>
-                      <a:fillRect/>
-                    </a:stretch>
-                  </pic:blipFill>
-                  <pic:spPr>
-                    <a:xfrm>
-                      <a:off x="0" y="0"/>
-                      <a:ext cx="4500000" cy="4394531"/>
-                    </a:xfrm>
-                    <a:prstGeom prst="rect"/>
-                  </pic:spPr>
-                </pic:pic>
-              </a:graphicData>
-            </a:graphic>
-          </wp:inline>
-        </w:drawing>
+        <w:rPr>
+          <w:rFonts w:ascii="Comic Sans MS" w:hAnsi="Comic Sans MS" w:cs="Comic Sans MS"/>
+          <w:b/>
+          <w:sz w:val="28"/>
+        </w:rPr>
+        <w:t>NOTES</w:t>
       </w:r>
+    </w:p>
+    <w:tbl>
+      <w:tblPr>
+        <w:tblW w:type="auto" w:w="0"/>
+        <w:tblLook w:firstColumn="1" w:firstRow="1" w:lastColumn="0" w:lastRow="0" w:noHBand="0" w:noVBand="1" w:val="04A0"/>
+        <w:tblBorders>
+          <w:top w:val="single" w:sz="4" w:space="0" w:color="808080"/>
+          <w:left w:val="single" w:sz="4" w:space="0" w:color="808080"/>
+          <w:bottom w:val="single" w:sz="4" w:space="0" w:color="808080"/>
+          <w:right w:val="single" w:sz="4" w:space="0" w:color="808080"/>
+          <w:insideH w:val="single" w:sz="4" w:space="0" w:color="808080"/>
+          <w:insideV w:val="single" w:sz="4" w:space="0" w:color="808080"/>
+        </w:tblBorders>
+      </w:tblPr>
+      <w:tblGrid>
+        <w:gridCol w:w="9354"/>
+      </w:tblGrid>
+      <w:tr>
+        <w:tc>
+          <w:tcPr>
+            <w:tcW w:type="dxa" w:w="9354"/>
+          </w:tcPr>
+          <w:p>
+            <w:pPr>
+              <w:spacing w:after="40"/>
+            </w:pPr>
+            <w:r>
+              <w:rPr>
+                <w:rFonts w:ascii="Comic Sans MS" w:hAnsi="Comic Sans MS"/>
+                <w:b w:val="0"/>
+                <w:sz w:val="20"/>
+              </w:rPr>
+              <w:t>NOTES:</w:t>
+            </w:r>
+          </w:p>
+          <w:p>
+            <w:pPr>
+              <w:spacing w:after="0"/>
+            </w:pPr>
+            <w:r>
+              <w:rPr>
+                <w:rFonts w:ascii="Comic Sans MS" w:hAnsi="Comic Sans MS"/>
+                <w:sz w:val="18"/>
+              </w:rPr>
+              <w:t>Social proof sits next to the price because it is the strongest reason to book; the weather is a separate request so a slow forecast never delays the page.</w:t>
+            </w:r>
+          </w:p>
+        </w:tc>
+      </w:tr>
+    </w:tbl>
+    <w:p>
+      <w:pPr>
+        <w:spacing w:after="0"/>
+      </w:pPr>
     </w:p>
     <w:tbl>
       <w:tblPr>
@@ -872,45 +1667,310 @@
         <w:t>Elements:</w:t>
       </w:r>
     </w:p>
-    <w:p>
-      <w:pPr>
-        <w:spacing w:after="120"/>
-        <w:jc w:val="center"/>
+    <w:tbl>
+      <w:tblPr>
+        <w:tblW w:type="auto" w:w="0"/>
+        <w:tblLook w:firstColumn="1" w:firstRow="1" w:lastColumn="0" w:lastRow="0" w:noHBand="0" w:noVBand="1" w:val="04A0"/>
+        <w:tblBorders>
+          <w:top w:val="single" w:sz="4" w:space="0" w:color="808080"/>
+          <w:left w:val="single" w:sz="4" w:space="0" w:color="808080"/>
+          <w:bottom w:val="single" w:sz="4" w:space="0" w:color="808080"/>
+          <w:right w:val="single" w:sz="4" w:space="0" w:color="808080"/>
+          <w:insideH w:val="single" w:sz="4" w:space="0" w:color="808080"/>
+          <w:insideV w:val="single" w:sz="4" w:space="0" w:color="808080"/>
+        </w:tblBorders>
+      </w:tblPr>
+      <w:tblGrid>
+        <w:gridCol w:w="9354"/>
+      </w:tblGrid>
+      <w:tr>
+        <w:tc>
+          <w:tcPr>
+            <w:tcW w:type="dxa" w:w="9354"/>
+          </w:tcPr>
+          <w:p>
+            <w:pPr>
+              <w:spacing w:after="40"/>
+            </w:pPr>
+            <w:r>
+              <w:rPr>
+                <w:rFonts w:ascii="Comic Sans MS" w:hAnsi="Comic Sans MS"/>
+                <w:b w:val="0"/>
+                <w:sz w:val="20"/>
+              </w:rPr>
+              <w:t>GRAPHICS:</w:t>
+            </w:r>
+          </w:p>
+          <w:p>
+            <w:pPr>
+              <w:spacing w:after="40"/>
+              <w:jc w:val="center"/>
+            </w:pPr>
+            <w:r>
+              <w:drawing>
+                <wp:inline xmlns:a="http://schemas.openxmlformats.org/drawingml/2006/main" xmlns:pic="http://schemas.openxmlformats.org/drawingml/2006/picture">
+                  <wp:extent cx="3780000" cy="3691406"/>
+                  <wp:docPr id="4" name="Picture 4"/>
+                  <wp:cNvGraphicFramePr>
+                    <a:graphicFrameLocks noChangeAspect="1"/>
+                  </wp:cNvGraphicFramePr>
+                  <a:graphic>
+                    <a:graphicData uri="http://schemas.openxmlformats.org/drawingml/2006/picture">
+                      <pic:pic>
+                        <pic:nvPicPr>
+                          <pic:cNvPr id="0" name="S4-register.png"/>
+                          <pic:cNvPicPr/>
+                        </pic:nvPicPr>
+                        <pic:blipFill>
+                          <a:blip r:embed="rId10"/>
+                          <a:stretch>
+                            <a:fillRect/>
+                          </a:stretch>
+                        </pic:blipFill>
+                        <pic:spPr>
+                          <a:xfrm>
+                            <a:off x="0" y="0"/>
+                            <a:ext cx="3780000" cy="3691406"/>
+                          </a:xfrm>
+                          <a:prstGeom prst="rect"/>
+                        </pic:spPr>
+                      </pic:pic>
+                    </a:graphicData>
+                  </a:graphic>
+                </wp:inline>
+              </w:drawing>
+            </w:r>
+          </w:p>
+          <w:p>
+            <w:pPr>
+              <w:spacing w:after="0"/>
+            </w:pPr>
+            <w:r>
+              <w:rPr>
+                <w:rFonts w:ascii="Comic Sans MS" w:hAnsi="Comic Sans MS"/>
+                <w:sz w:val="18"/>
+              </w:rPr>
+              <w:t>Live screenshot of the deployed page (https://24831941.it.scu.edu.au), taken with headless Chrome. The layout is the design; every value on it comes from the API.</w:t>
+            </w:r>
+          </w:p>
+        </w:tc>
+      </w:tr>
+    </w:tbl>
+    <w:p>
+      <w:pPr>
+        <w:spacing w:after="0"/>
+      </w:pPr>
+    </w:p>
+    <w:tbl>
+      <w:tblPr>
+        <w:tblW w:type="auto" w:w="0"/>
+        <w:tblLook w:firstColumn="1" w:firstRow="1" w:lastColumn="0" w:lastRow="0" w:noHBand="0" w:noVBand="1" w:val="04A0"/>
+        <w:tblBorders>
+          <w:top w:val="single" w:sz="4" w:space="0" w:color="808080"/>
+          <w:left w:val="single" w:sz="4" w:space="0" w:color="808080"/>
+          <w:bottom w:val="single" w:sz="4" w:space="0" w:color="808080"/>
+          <w:right w:val="single" w:sz="4" w:space="0" w:color="808080"/>
+          <w:insideH w:val="single" w:sz="4" w:space="0" w:color="808080"/>
+          <w:insideV w:val="single" w:sz="4" w:space="0" w:color="808080"/>
+        </w:tblBorders>
+      </w:tblPr>
+      <w:tblGrid>
+        <w:gridCol w:w="9354"/>
+      </w:tblGrid>
+      <w:tr>
+        <w:tc>
+          <w:tcPr>
+            <w:tcW w:type="dxa" w:w="9354"/>
+          </w:tcPr>
+          <w:p>
+            <w:pPr>
+              <w:spacing w:after="40"/>
+            </w:pPr>
+            <w:r>
+              <w:rPr>
+                <w:rFonts w:ascii="Comic Sans MS" w:hAnsi="Comic Sans MS"/>
+                <w:b w:val="0"/>
+                <w:sz w:val="20"/>
+              </w:rPr>
+              <w:t>TEXT:</w:t>
+            </w:r>
+          </w:p>
+          <w:p>
+            <w:pPr>
+              <w:spacing w:after="0"/>
+            </w:pPr>
+            <w:r>
+              <w:rPr>
+                <w:rFonts w:ascii="Comic Sans MS" w:hAnsi="Comic Sans MS"/>
+                <w:sz w:val="18"/>
+              </w:rPr>
+              <w:t>Title: 'Register for an event'; left panel shows the event name, date, time, venue and price per ticket</w:t>
+            </w:r>
+          </w:p>
+          <w:p>
+            <w:pPr>
+              <w:spacing w:after="0"/>
+            </w:pPr>
+            <w:r>
+              <w:rPr>
+                <w:rFonts w:ascii="Comic Sans MS" w:hAnsi="Comic Sans MS"/>
+                <w:sz w:val="18"/>
+              </w:rPr>
+              <w:t>Form heading 'Your details'; labels: First name / Last name / Email / Contact phone / Number of tickets / Date of registration / Notes (optional)</w:t>
+            </w:r>
+          </w:p>
+          <w:p>
+            <w:pPr>
+              <w:spacing w:after="0"/>
+            </w:pPr>
+            <w:r>
+              <w:rPr>
+                <w:rFonts w:ascii="Comic Sans MS" w:hAnsi="Comic Sans MS"/>
+                <w:sz w:val="18"/>
+              </w:rPr>
+              <w:t>Live 'Total: $X'; button 'Complete registration'</w:t>
+            </w:r>
+          </w:p>
+          <w:p>
+            <w:pPr>
+              <w:spacing w:after="0"/>
+            </w:pPr>
+            <w:r>
+              <w:rPr>
+                <w:rFonts w:ascii="Comic Sans MS" w:hAnsi="Comic Sans MS"/>
+                <w:sz w:val="18"/>
+              </w:rPr>
+              <w:t>On success the form is replaced by 'You are registered' plus the booking details and a back link</w:t>
+            </w:r>
+          </w:p>
+        </w:tc>
+      </w:tr>
+    </w:tbl>
+    <w:p>
+      <w:pPr>
+        <w:spacing w:after="0"/>
+      </w:pPr>
+    </w:p>
+    <w:tbl>
+      <w:tblPr>
+        <w:tblW w:type="auto" w:w="0"/>
+        <w:tblLook w:firstColumn="1" w:firstRow="1" w:lastColumn="0" w:lastRow="0" w:noHBand="0" w:noVBand="1" w:val="04A0"/>
+        <w:tblBorders>
+          <w:top w:val="single" w:sz="4" w:space="0" w:color="808080"/>
+          <w:left w:val="single" w:sz="4" w:space="0" w:color="808080"/>
+          <w:bottom w:val="single" w:sz="4" w:space="0" w:color="808080"/>
+          <w:right w:val="single" w:sz="4" w:space="0" w:color="808080"/>
+          <w:insideH w:val="single" w:sz="4" w:space="0" w:color="808080"/>
+          <w:insideV w:val="single" w:sz="4" w:space="0" w:color="808080"/>
+        </w:tblBorders>
+      </w:tblPr>
+      <w:tblGrid>
+        <w:gridCol w:w="9354"/>
+      </w:tblGrid>
+      <w:tr>
+        <w:tc>
+          <w:tcPr>
+            <w:tcW w:type="dxa" w:w="9354"/>
+          </w:tcPr>
+          <w:p>
+            <w:pPr>
+              <w:spacing w:after="40"/>
+            </w:pPr>
+            <w:r>
+              <w:rPr>
+                <w:rFonts w:ascii="Comic Sans MS" w:hAnsi="Comic Sans MS"/>
+                <w:b w:val="0"/>
+                <w:sz w:val="20"/>
+              </w:rPr>
+              <w:t>AUDIO/VIDEO:</w:t>
+            </w:r>
+          </w:p>
+          <w:p>
+            <w:pPr>
+              <w:spacing w:after="0"/>
+            </w:pPr>
+            <w:r>
+              <w:rPr>
+                <w:rFonts w:ascii="Comic Sans MS" w:hAnsi="Comic Sans MS"/>
+                <w:sz w:val="18"/>
+              </w:rPr>
+              <w:t>None - the page is form and data only. The total is computed live from tickets x price.</w:t>
+            </w:r>
+          </w:p>
+        </w:tc>
+      </w:tr>
+    </w:tbl>
+    <w:p>
+      <w:pPr>
+        <w:spacing w:after="0"/>
+      </w:pPr>
+    </w:p>
+    <w:p>
+      <w:pPr>
+        <w:spacing w:after="40"/>
       </w:pPr>
       <w:r>
-        <w:drawing>
-          <wp:inline xmlns:a="http://schemas.openxmlformats.org/drawingml/2006/main" xmlns:pic="http://schemas.openxmlformats.org/drawingml/2006/picture">
-            <wp:extent cx="4500000" cy="4394531"/>
-            <wp:docPr id="4" name="Picture 4"/>
-            <wp:cNvGraphicFramePr>
-              <a:graphicFrameLocks noChangeAspect="1"/>
-            </wp:cNvGraphicFramePr>
-            <a:graphic>
-              <a:graphicData uri="http://schemas.openxmlformats.org/drawingml/2006/picture">
-                <pic:pic>
-                  <pic:nvPicPr>
-                    <pic:cNvPr id="0" name="S4-register.png"/>
-                    <pic:cNvPicPr/>
-                  </pic:nvPicPr>
-                  <pic:blipFill>
-                    <a:blip r:embed="rId10"/>
-                    <a:stretch>
-                      <a:fillRect/>
-                    </a:stretch>
-                  </pic:blipFill>
-                  <pic:spPr>
-                    <a:xfrm>
-                      <a:off x="0" y="0"/>
-                      <a:ext cx="4500000" cy="4394531"/>
-                    </a:xfrm>
-                    <a:prstGeom prst="rect"/>
-                  </pic:spPr>
-                </pic:pic>
-              </a:graphicData>
-            </a:graphic>
-          </wp:inline>
-        </w:drawing>
+        <w:rPr>
+          <w:rFonts w:ascii="Comic Sans MS" w:hAnsi="Comic Sans MS" w:cs="Comic Sans MS"/>
+          <w:b/>
+          <w:sz w:val="28"/>
+        </w:rPr>
+        <w:t>NOTES</w:t>
       </w:r>
+    </w:p>
+    <w:tbl>
+      <w:tblPr>
+        <w:tblW w:type="auto" w:w="0"/>
+        <w:tblLook w:firstColumn="1" w:firstRow="1" w:lastColumn="0" w:lastRow="0" w:noHBand="0" w:noVBand="1" w:val="04A0"/>
+        <w:tblBorders>
+          <w:top w:val="single" w:sz="4" w:space="0" w:color="808080"/>
+          <w:left w:val="single" w:sz="4" w:space="0" w:color="808080"/>
+          <w:bottom w:val="single" w:sz="4" w:space="0" w:color="808080"/>
+          <w:right w:val="single" w:sz="4" w:space="0" w:color="808080"/>
+          <w:insideH w:val="single" w:sz="4" w:space="0" w:color="808080"/>
+          <w:insideV w:val="single" w:sz="4" w:space="0" w:color="808080"/>
+        </w:tblBorders>
+      </w:tblPr>
+      <w:tblGrid>
+        <w:gridCol w:w="9354"/>
+      </w:tblGrid>
+      <w:tr>
+        <w:tc>
+          <w:tcPr>
+            <w:tcW w:type="dxa" w:w="9354"/>
+          </w:tcPr>
+          <w:p>
+            <w:pPr>
+              <w:spacing w:after="40"/>
+            </w:pPr>
+            <w:r>
+              <w:rPr>
+                <w:rFonts w:ascii="Comic Sans MS" w:hAnsi="Comic Sans MS"/>
+                <w:b w:val="0"/>
+                <w:sz w:val="20"/>
+              </w:rPr>
+              <w:t>NOTES:</w:t>
+            </w:r>
+          </w:p>
+          <w:p>
+            <w:pPr>
+              <w:spacing w:after="0"/>
+            </w:pPr>
+            <w:r>
+              <w:rPr>
+                <w:rFonts w:ascii="Comic Sans MS" w:hAnsi="Comic Sans MS"/>
+                <w:sz w:val="18"/>
+              </w:rPr>
+              <w:t>Two columns: what you are booking on the left, who you are on the right - reasons before demands. Each field carries its own message instead of one generic alert, and a 409 shows the API's sentence verbatim.</w:t>
+            </w:r>
+          </w:p>
+        </w:tc>
+      </w:tr>
+    </w:tbl>
+    <w:p>
+      <w:pPr>
+        <w:spacing w:after="0"/>
+      </w:pPr>
     </w:p>
     <w:tbl>
       <w:tblPr>
@@ -1145,45 +2205,322 @@
         <w:t>Elements:</w:t>
       </w:r>
     </w:p>
-    <w:p>
-      <w:pPr>
-        <w:spacing w:after="120"/>
-        <w:jc w:val="center"/>
+    <w:tbl>
+      <w:tblPr>
+        <w:tblW w:type="auto" w:w="0"/>
+        <w:tblLook w:firstColumn="1" w:firstRow="1" w:lastColumn="0" w:lastRow="0" w:noHBand="0" w:noVBand="1" w:val="04A0"/>
+        <w:tblBorders>
+          <w:top w:val="single" w:sz="4" w:space="0" w:color="808080"/>
+          <w:left w:val="single" w:sz="4" w:space="0" w:color="808080"/>
+          <w:bottom w:val="single" w:sz="4" w:space="0" w:color="808080"/>
+          <w:right w:val="single" w:sz="4" w:space="0" w:color="808080"/>
+          <w:insideH w:val="single" w:sz="4" w:space="0" w:color="808080"/>
+          <w:insideV w:val="single" w:sz="4" w:space="0" w:color="808080"/>
+        </w:tblBorders>
+      </w:tblPr>
+      <w:tblGrid>
+        <w:gridCol w:w="9354"/>
+      </w:tblGrid>
+      <w:tr>
+        <w:tc>
+          <w:tcPr>
+            <w:tcW w:type="dxa" w:w="9354"/>
+          </w:tcPr>
+          <w:p>
+            <w:pPr>
+              <w:spacing w:after="40"/>
+            </w:pPr>
+            <w:r>
+              <w:rPr>
+                <w:rFonts w:ascii="Comic Sans MS" w:hAnsi="Comic Sans MS"/>
+                <w:b w:val="0"/>
+                <w:sz w:val="20"/>
+              </w:rPr>
+              <w:t>GRAPHICS:</w:t>
+            </w:r>
+          </w:p>
+          <w:p>
+            <w:pPr>
+              <w:spacing w:after="40"/>
+              <w:jc w:val="center"/>
+            </w:pPr>
+            <w:r>
+              <w:drawing>
+                <wp:inline xmlns:a="http://schemas.openxmlformats.org/drawingml/2006/main" xmlns:pic="http://schemas.openxmlformats.org/drawingml/2006/picture">
+                  <wp:extent cx="3780000" cy="3691406"/>
+                  <wp:docPr id="5" name="Picture 5"/>
+                  <wp:cNvGraphicFramePr>
+                    <a:graphicFrameLocks noChangeAspect="1"/>
+                  </wp:cNvGraphicFramePr>
+                  <a:graphic>
+                    <a:graphicData uri="http://schemas.openxmlformats.org/drawingml/2006/picture">
+                      <pic:pic>
+                        <pic:nvPicPr>
+                          <pic:cNvPr id="0" name="S5-admin-list.png"/>
+                          <pic:cNvPicPr/>
+                        </pic:nvPicPr>
+                        <pic:blipFill>
+                          <a:blip r:embed="rId11"/>
+                          <a:stretch>
+                            <a:fillRect/>
+                          </a:stretch>
+                        </pic:blipFill>
+                        <pic:spPr>
+                          <a:xfrm>
+                            <a:off x="0" y="0"/>
+                            <a:ext cx="3780000" cy="3691406"/>
+                          </a:xfrm>
+                          <a:prstGeom prst="rect"/>
+                        </pic:spPr>
+                      </pic:pic>
+                    </a:graphicData>
+                  </a:graphic>
+                </wp:inline>
+              </w:drawing>
+            </w:r>
+          </w:p>
+          <w:p>
+            <w:pPr>
+              <w:spacing w:after="0"/>
+            </w:pPr>
+            <w:r>
+              <w:rPr>
+                <w:rFonts w:ascii="Comic Sans MS" w:hAnsi="Comic Sans MS"/>
+                <w:sz w:val="18"/>
+              </w:rPr>
+              <w:t>Live screenshot of the deployed page (https://24831941.it.scu.edu.au), taken with headless Chrome. The layout is the design; every value on it comes from the API.</w:t>
+            </w:r>
+          </w:p>
+        </w:tc>
+      </w:tr>
+    </w:tbl>
+    <w:p>
+      <w:pPr>
+        <w:spacing w:after="0"/>
+      </w:pPr>
+    </w:p>
+    <w:tbl>
+      <w:tblPr>
+        <w:tblW w:type="auto" w:w="0"/>
+        <w:tblLook w:firstColumn="1" w:firstRow="1" w:lastColumn="0" w:lastRow="0" w:noHBand="0" w:noVBand="1" w:val="04A0"/>
+        <w:tblBorders>
+          <w:top w:val="single" w:sz="4" w:space="0" w:color="808080"/>
+          <w:left w:val="single" w:sz="4" w:space="0" w:color="808080"/>
+          <w:bottom w:val="single" w:sz="4" w:space="0" w:color="808080"/>
+          <w:right w:val="single" w:sz="4" w:space="0" w:color="808080"/>
+          <w:insideH w:val="single" w:sz="4" w:space="0" w:color="808080"/>
+          <w:insideV w:val="single" w:sz="4" w:space="0" w:color="808080"/>
+        </w:tblBorders>
+      </w:tblPr>
+      <w:tblGrid>
+        <w:gridCol w:w="9354"/>
+      </w:tblGrid>
+      <w:tr>
+        <w:tc>
+          <w:tcPr>
+            <w:tcW w:type="dxa" w:w="9354"/>
+          </w:tcPr>
+          <w:p>
+            <w:pPr>
+              <w:spacing w:after="40"/>
+            </w:pPr>
+            <w:r>
+              <w:rPr>
+                <w:rFonts w:ascii="Comic Sans MS" w:hAnsi="Comic Sans MS"/>
+                <w:b w:val="0"/>
+                <w:sz w:val="20"/>
+              </w:rPr>
+              <w:t>TEXT:</w:t>
+            </w:r>
+          </w:p>
+          <w:p>
+            <w:pPr>
+              <w:spacing w:after="0"/>
+            </w:pPr>
+            <w:r>
+              <w:rPr>
+                <w:rFonts w:ascii="Comic Sans MS" w:hAnsi="Comic Sans MS"/>
+                <w:sz w:val="18"/>
+              </w:rPr>
+              <w:t>Title: 'Events' and one sentence saying what the site can change</w:t>
+            </w:r>
+          </w:p>
+          <w:p>
+            <w:pPr>
+              <w:spacing w:after="0"/>
+            </w:pPr>
+            <w:r>
+              <w:rPr>
+                <w:rFonts w:ascii="Comic Sans MS" w:hAnsi="Comic Sans MS"/>
+                <w:sz w:val="18"/>
+              </w:rPr>
+              <w:t>Button: '+ New event'</w:t>
+            </w:r>
+          </w:p>
+          <w:p>
+            <w:pPr>
+              <w:spacing w:after="0"/>
+            </w:pPr>
+            <w:r>
+              <w:rPr>
+                <w:rFonts w:ascii="Comic Sans MS" w:hAnsi="Comic Sans MS"/>
+                <w:sz w:val="18"/>
+              </w:rPr>
+              <w:t>Filter chips with live counts: All 13 / Active 8 / Past 4 / Suspended 1</w:t>
+            </w:r>
+          </w:p>
+          <w:p>
+            <w:pPr>
+              <w:spacing w:after="0"/>
+            </w:pPr>
+            <w:r>
+              <w:rPr>
+                <w:rFonts w:ascii="Comic Sans MS" w:hAnsi="Comic Sans MS"/>
+                <w:sz w:val="18"/>
+              </w:rPr>
+              <w:t>Column headings: ID / Event / Date / Location / Status / Ticket / Registrations / Actions</w:t>
+            </w:r>
+          </w:p>
+          <w:p>
+            <w:pPr>
+              <w:spacing w:after="0"/>
+            </w:pPr>
+            <w:r>
+              <w:rPr>
+                <w:rFonts w:ascii="Comic Sans MS" w:hAnsi="Comic Sans MS"/>
+                <w:sz w:val="18"/>
+              </w:rPr>
+              <w:t>Row buttons: 'Edit' / 'Delete'</w:t>
+            </w:r>
+          </w:p>
+        </w:tc>
+      </w:tr>
+    </w:tbl>
+    <w:p>
+      <w:pPr>
+        <w:spacing w:after="0"/>
+      </w:pPr>
+    </w:p>
+    <w:tbl>
+      <w:tblPr>
+        <w:tblW w:type="auto" w:w="0"/>
+        <w:tblLook w:firstColumn="1" w:firstRow="1" w:lastColumn="0" w:lastRow="0" w:noHBand="0" w:noVBand="1" w:val="04A0"/>
+        <w:tblBorders>
+          <w:top w:val="single" w:sz="4" w:space="0" w:color="808080"/>
+          <w:left w:val="single" w:sz="4" w:space="0" w:color="808080"/>
+          <w:bottom w:val="single" w:sz="4" w:space="0" w:color="808080"/>
+          <w:right w:val="single" w:sz="4" w:space="0" w:color="808080"/>
+          <w:insideH w:val="single" w:sz="4" w:space="0" w:color="808080"/>
+          <w:insideV w:val="single" w:sz="4" w:space="0" w:color="808080"/>
+        </w:tblBorders>
+      </w:tblPr>
+      <w:tblGrid>
+        <w:gridCol w:w="9354"/>
+      </w:tblGrid>
+      <w:tr>
+        <w:tc>
+          <w:tcPr>
+            <w:tcW w:type="dxa" w:w="9354"/>
+          </w:tcPr>
+          <w:p>
+            <w:pPr>
+              <w:spacing w:after="40"/>
+            </w:pPr>
+            <w:r>
+              <w:rPr>
+                <w:rFonts w:ascii="Comic Sans MS" w:hAnsi="Comic Sans MS"/>
+                <w:b w:val="0"/>
+                <w:sz w:val="20"/>
+              </w:rPr>
+              <w:t>AUDIO/VIDEO:</w:t>
+            </w:r>
+          </w:p>
+          <w:p>
+            <w:pPr>
+              <w:spacing w:after="0"/>
+            </w:pPr>
+            <w:r>
+              <w:rPr>
+                <w:rFonts w:ascii="Comic Sans MS" w:hAnsi="Comic Sans MS"/>
+                <w:sz w:val="18"/>
+              </w:rPr>
+              <w:t>None. Status badges are coloured text, and the counts are rendered from the rows actually on screen.</w:t>
+            </w:r>
+          </w:p>
+        </w:tc>
+      </w:tr>
+    </w:tbl>
+    <w:p>
+      <w:pPr>
+        <w:spacing w:after="0"/>
+      </w:pPr>
+    </w:p>
+    <w:p>
+      <w:pPr>
+        <w:spacing w:after="40"/>
       </w:pPr>
       <w:r>
-        <w:drawing>
-          <wp:inline xmlns:a="http://schemas.openxmlformats.org/drawingml/2006/main" xmlns:pic="http://schemas.openxmlformats.org/drawingml/2006/picture">
-            <wp:extent cx="4500000" cy="4394531"/>
-            <wp:docPr id="5" name="Picture 5"/>
-            <wp:cNvGraphicFramePr>
-              <a:graphicFrameLocks noChangeAspect="1"/>
-            </wp:cNvGraphicFramePr>
-            <a:graphic>
-              <a:graphicData uri="http://schemas.openxmlformats.org/drawingml/2006/picture">
-                <pic:pic>
-                  <pic:nvPicPr>
-                    <pic:cNvPr id="0" name="S5-admin-list.png"/>
-                    <pic:cNvPicPr/>
-                  </pic:nvPicPr>
-                  <pic:blipFill>
-                    <a:blip r:embed="rId11"/>
-                    <a:stretch>
-                      <a:fillRect/>
-                    </a:stretch>
-                  </pic:blipFill>
-                  <pic:spPr>
-                    <a:xfrm>
-                      <a:off x="0" y="0"/>
-                      <a:ext cx="4500000" cy="4394531"/>
-                    </a:xfrm>
-                    <a:prstGeom prst="rect"/>
-                  </pic:spPr>
-                </pic:pic>
-              </a:graphicData>
-            </a:graphic>
-          </wp:inline>
-        </w:drawing>
+        <w:rPr>
+          <w:rFonts w:ascii="Comic Sans MS" w:hAnsi="Comic Sans MS" w:cs="Comic Sans MS"/>
+          <w:b/>
+          <w:sz w:val="28"/>
+        </w:rPr>
+        <w:t>NOTES</w:t>
       </w:r>
+    </w:p>
+    <w:tbl>
+      <w:tblPr>
+        <w:tblW w:type="auto" w:w="0"/>
+        <w:tblLook w:firstColumn="1" w:firstRow="1" w:lastColumn="0" w:lastRow="0" w:noHBand="0" w:noVBand="1" w:val="04A0"/>
+        <w:tblBorders>
+          <w:top w:val="single" w:sz="4" w:space="0" w:color="808080"/>
+          <w:left w:val="single" w:sz="4" w:space="0" w:color="808080"/>
+          <w:bottom w:val="single" w:sz="4" w:space="0" w:color="808080"/>
+          <w:right w:val="single" w:sz="4" w:space="0" w:color="808080"/>
+          <w:insideH w:val="single" w:sz="4" w:space="0" w:color="808080"/>
+          <w:insideV w:val="single" w:sz="4" w:space="0" w:color="808080"/>
+        </w:tblBorders>
+      </w:tblPr>
+      <w:tblGrid>
+        <w:gridCol w:w="9354"/>
+      </w:tblGrid>
+      <w:tr>
+        <w:tc>
+          <w:tcPr>
+            <w:tcW w:type="dxa" w:w="9354"/>
+          </w:tcPr>
+          <w:p>
+            <w:pPr>
+              <w:spacing w:after="40"/>
+            </w:pPr>
+            <w:r>
+              <w:rPr>
+                <w:rFonts w:ascii="Comic Sans MS" w:hAnsi="Comic Sans MS"/>
+                <w:b w:val="0"/>
+                <w:sz w:val="20"/>
+              </w:rPr>
+              <w:t>NOTES:</w:t>
+            </w:r>
+          </w:p>
+          <w:p>
+            <w:pPr>
+              <w:spacing w:after="0"/>
+            </w:pPr>
+            <w:r>
+              <w:rPr>
+                <w:rFonts w:ascii="Comic Sans MS" w:hAnsi="Comic Sans MS"/>
+                <w:sz w:val="18"/>
+              </w:rPr>
+              <w:t>Counts live on the filter chips because 'how many suspended?' is the first question staff ask. A blocked delete reports the reason and the alternative (suspend it) rather than failing silently.</w:t>
+            </w:r>
+          </w:p>
+        </w:tc>
+      </w:tr>
+    </w:tbl>
+    <w:p>
+      <w:pPr>
+        <w:spacing w:after="0"/>
+      </w:pPr>
     </w:p>
     <w:tbl>
       <w:tblPr>
@@ -1420,45 +2757,310 @@
         <w:t>Elements:</w:t>
       </w:r>
     </w:p>
-    <w:p>
-      <w:pPr>
-        <w:spacing w:after="120"/>
-        <w:jc w:val="center"/>
+    <w:tbl>
+      <w:tblPr>
+        <w:tblW w:type="auto" w:w="0"/>
+        <w:tblLook w:firstColumn="1" w:firstRow="1" w:lastColumn="0" w:lastRow="0" w:noHBand="0" w:noVBand="1" w:val="04A0"/>
+        <w:tblBorders>
+          <w:top w:val="single" w:sz="4" w:space="0" w:color="808080"/>
+          <w:left w:val="single" w:sz="4" w:space="0" w:color="808080"/>
+          <w:bottom w:val="single" w:sz="4" w:space="0" w:color="808080"/>
+          <w:right w:val="single" w:sz="4" w:space="0" w:color="808080"/>
+          <w:insideH w:val="single" w:sz="4" w:space="0" w:color="808080"/>
+          <w:insideV w:val="single" w:sz="4" w:space="0" w:color="808080"/>
+        </w:tblBorders>
+      </w:tblPr>
+      <w:tblGrid>
+        <w:gridCol w:w="9354"/>
+      </w:tblGrid>
+      <w:tr>
+        <w:tc>
+          <w:tcPr>
+            <w:tcW w:type="dxa" w:w="9354"/>
+          </w:tcPr>
+          <w:p>
+            <w:pPr>
+              <w:spacing w:after="40"/>
+            </w:pPr>
+            <w:r>
+              <w:rPr>
+                <w:rFonts w:ascii="Comic Sans MS" w:hAnsi="Comic Sans MS"/>
+                <w:b w:val="0"/>
+                <w:sz w:val="20"/>
+              </w:rPr>
+              <w:t>GRAPHICS:</w:t>
+            </w:r>
+          </w:p>
+          <w:p>
+            <w:pPr>
+              <w:spacing w:after="40"/>
+              <w:jc w:val="center"/>
+            </w:pPr>
+            <w:r>
+              <w:drawing>
+                <wp:inline xmlns:a="http://schemas.openxmlformats.org/drawingml/2006/main" xmlns:pic="http://schemas.openxmlformats.org/drawingml/2006/picture">
+                  <wp:extent cx="3780000" cy="3691406"/>
+                  <wp:docPr id="6" name="Picture 6"/>
+                  <wp:cNvGraphicFramePr>
+                    <a:graphicFrameLocks noChangeAspect="1"/>
+                  </wp:cNvGraphicFramePr>
+                  <a:graphic>
+                    <a:graphicData uri="http://schemas.openxmlformats.org/drawingml/2006/picture">
+                      <pic:pic>
+                        <pic:nvPicPr>
+                          <pic:cNvPr id="0" name="S6-admin-new.png"/>
+                          <pic:cNvPicPr/>
+                        </pic:nvPicPr>
+                        <pic:blipFill>
+                          <a:blip r:embed="rId12"/>
+                          <a:stretch>
+                            <a:fillRect/>
+                          </a:stretch>
+                        </pic:blipFill>
+                        <pic:spPr>
+                          <a:xfrm>
+                            <a:off x="0" y="0"/>
+                            <a:ext cx="3780000" cy="3691406"/>
+                          </a:xfrm>
+                          <a:prstGeom prst="rect"/>
+                        </pic:spPr>
+                      </pic:pic>
+                    </a:graphicData>
+                  </a:graphic>
+                </wp:inline>
+              </w:drawing>
+            </w:r>
+          </w:p>
+          <w:p>
+            <w:pPr>
+              <w:spacing w:after="0"/>
+            </w:pPr>
+            <w:r>
+              <w:rPr>
+                <w:rFonts w:ascii="Comic Sans MS" w:hAnsi="Comic Sans MS"/>
+                <w:sz w:val="18"/>
+              </w:rPr>
+              <w:t>Live screenshot of the deployed page (https://24831941.it.scu.edu.au), taken with headless Chrome. The layout is the design; every value on it comes from the API.</w:t>
+            </w:r>
+          </w:p>
+        </w:tc>
+      </w:tr>
+    </w:tbl>
+    <w:p>
+      <w:pPr>
+        <w:spacing w:after="0"/>
+      </w:pPr>
+    </w:p>
+    <w:tbl>
+      <w:tblPr>
+        <w:tblW w:type="auto" w:w="0"/>
+        <w:tblLook w:firstColumn="1" w:firstRow="1" w:lastColumn="0" w:lastRow="0" w:noHBand="0" w:noVBand="1" w:val="04A0"/>
+        <w:tblBorders>
+          <w:top w:val="single" w:sz="4" w:space="0" w:color="808080"/>
+          <w:left w:val="single" w:sz="4" w:space="0" w:color="808080"/>
+          <w:bottom w:val="single" w:sz="4" w:space="0" w:color="808080"/>
+          <w:right w:val="single" w:sz="4" w:space="0" w:color="808080"/>
+          <w:insideH w:val="single" w:sz="4" w:space="0" w:color="808080"/>
+          <w:insideV w:val="single" w:sz="4" w:space="0" w:color="808080"/>
+        </w:tblBorders>
+      </w:tblPr>
+      <w:tblGrid>
+        <w:gridCol w:w="9354"/>
+      </w:tblGrid>
+      <w:tr>
+        <w:tc>
+          <w:tcPr>
+            <w:tcW w:type="dxa" w:w="9354"/>
+          </w:tcPr>
+          <w:p>
+            <w:pPr>
+              <w:spacing w:after="40"/>
+            </w:pPr>
+            <w:r>
+              <w:rPr>
+                <w:rFonts w:ascii="Comic Sans MS" w:hAnsi="Comic Sans MS"/>
+                <w:b w:val="0"/>
+                <w:sz w:val="20"/>
+              </w:rPr>
+              <w:t>TEXT:</w:t>
+            </w:r>
+          </w:p>
+          <w:p>
+            <w:pPr>
+              <w:spacing w:after="0"/>
+            </w:pPr>
+            <w:r>
+              <w:rPr>
+                <w:rFonts w:ascii="Comic Sans MS" w:hAnsi="Comic Sans MS"/>
+                <w:sz w:val="18"/>
+              </w:rPr>
+              <w:t>Title: 'New event'</w:t>
+            </w:r>
+          </w:p>
+          <w:p>
+            <w:pPr>
+              <w:spacing w:after="0"/>
+            </w:pPr>
+            <w:r>
+              <w:rPr>
+                <w:rFonts w:ascii="Comic Sans MS" w:hAnsi="Comic Sans MS"/>
+                <w:sz w:val="18"/>
+              </w:rPr>
+              <w:t>Required fields marked '*': name, description, organisation, category, status, date, start time, venue, city</w:t>
+            </w:r>
+          </w:p>
+          <w:p>
+            <w:pPr>
+              <w:spacing w:after="0"/>
+            </w:pPr>
+            <w:r>
+              <w:rPr>
+                <w:rFonts w:ascii="Comic Sans MS" w:hAnsi="Comic Sans MS"/>
+                <w:sz w:val="18"/>
+              </w:rPr>
+              <w:t>Optional: summary, end time, suburb, ticket price, goal, raised so far, latitude / longitude ('Used by the Open-Meteo forecast on the event page. Leave blank if unknown.')</w:t>
+            </w:r>
+          </w:p>
+          <w:p>
+            <w:pPr>
+              <w:spacing w:after="0"/>
+            </w:pPr>
+            <w:r>
+              <w:rPr>
+                <w:rFonts w:ascii="Comic Sans MS" w:hAnsi="Comic Sans MS"/>
+                <w:sz w:val="18"/>
+              </w:rPr>
+              <w:t>Buttons: 'Save changes' / 'Cancel'</w:t>
+            </w:r>
+          </w:p>
+        </w:tc>
+      </w:tr>
+    </w:tbl>
+    <w:p>
+      <w:pPr>
+        <w:spacing w:after="0"/>
+      </w:pPr>
+    </w:p>
+    <w:tbl>
+      <w:tblPr>
+        <w:tblW w:type="auto" w:w="0"/>
+        <w:tblLook w:firstColumn="1" w:firstRow="1" w:lastColumn="0" w:lastRow="0" w:noHBand="0" w:noVBand="1" w:val="04A0"/>
+        <w:tblBorders>
+          <w:top w:val="single" w:sz="4" w:space="0" w:color="808080"/>
+          <w:left w:val="single" w:sz="4" w:space="0" w:color="808080"/>
+          <w:bottom w:val="single" w:sz="4" w:space="0" w:color="808080"/>
+          <w:right w:val="single" w:sz="4" w:space="0" w:color="808080"/>
+          <w:insideH w:val="single" w:sz="4" w:space="0" w:color="808080"/>
+          <w:insideV w:val="single" w:sz="4" w:space="0" w:color="808080"/>
+        </w:tblBorders>
+      </w:tblPr>
+      <w:tblGrid>
+        <w:gridCol w:w="9354"/>
+      </w:tblGrid>
+      <w:tr>
+        <w:tc>
+          <w:tcPr>
+            <w:tcW w:type="dxa" w:w="9354"/>
+          </w:tcPr>
+          <w:p>
+            <w:pPr>
+              <w:spacing w:after="40"/>
+            </w:pPr>
+            <w:r>
+              <w:rPr>
+                <w:rFonts w:ascii="Comic Sans MS" w:hAnsi="Comic Sans MS"/>
+                <w:b w:val="0"/>
+                <w:sz w:val="20"/>
+              </w:rPr>
+              <w:t>AUDIO/VIDEO:</w:t>
+            </w:r>
+          </w:p>
+          <w:p>
+            <w:pPr>
+              <w:spacing w:after="0"/>
+            </w:pPr>
+            <w:r>
+              <w:rPr>
+                <w:rFonts w:ascii="Comic Sans MS" w:hAnsi="Comic Sans MS"/>
+                <w:sz w:val="18"/>
+              </w:rPr>
+              <w:t>None. The two selects are filled from GET /api/organisations and GET /api/categories, the same lists the public site shows.</w:t>
+            </w:r>
+          </w:p>
+        </w:tc>
+      </w:tr>
+    </w:tbl>
+    <w:p>
+      <w:pPr>
+        <w:spacing w:after="0"/>
+      </w:pPr>
+    </w:p>
+    <w:p>
+      <w:pPr>
+        <w:spacing w:after="40"/>
       </w:pPr>
       <w:r>
-        <w:drawing>
-          <wp:inline xmlns:a="http://schemas.openxmlformats.org/drawingml/2006/main" xmlns:pic="http://schemas.openxmlformats.org/drawingml/2006/picture">
-            <wp:extent cx="4500000" cy="4394531"/>
-            <wp:docPr id="6" name="Picture 6"/>
-            <wp:cNvGraphicFramePr>
-              <a:graphicFrameLocks noChangeAspect="1"/>
-            </wp:cNvGraphicFramePr>
-            <a:graphic>
-              <a:graphicData uri="http://schemas.openxmlformats.org/drawingml/2006/picture">
-                <pic:pic>
-                  <pic:nvPicPr>
-                    <pic:cNvPr id="0" name="S6-admin-new.png"/>
-                    <pic:cNvPicPr/>
-                  </pic:nvPicPr>
-                  <pic:blipFill>
-                    <a:blip r:embed="rId12"/>
-                    <a:stretch>
-                      <a:fillRect/>
-                    </a:stretch>
-                  </pic:blipFill>
-                  <pic:spPr>
-                    <a:xfrm>
-                      <a:off x="0" y="0"/>
-                      <a:ext cx="4500000" cy="4394531"/>
-                    </a:xfrm>
-                    <a:prstGeom prst="rect"/>
-                  </pic:spPr>
-                </pic:pic>
-              </a:graphicData>
-            </a:graphic>
-          </wp:inline>
-        </w:drawing>
+        <w:rPr>
+          <w:rFonts w:ascii="Comic Sans MS" w:hAnsi="Comic Sans MS" w:cs="Comic Sans MS"/>
+          <w:b/>
+          <w:sz w:val="28"/>
+        </w:rPr>
+        <w:t>NOTES</w:t>
       </w:r>
+    </w:p>
+    <w:tbl>
+      <w:tblPr>
+        <w:tblW w:type="auto" w:w="0"/>
+        <w:tblLook w:firstColumn="1" w:firstRow="1" w:lastColumn="0" w:lastRow="0" w:noHBand="0" w:noVBand="1" w:val="04A0"/>
+        <w:tblBorders>
+          <w:top w:val="single" w:sz="4" w:space="0" w:color="808080"/>
+          <w:left w:val="single" w:sz="4" w:space="0" w:color="808080"/>
+          <w:bottom w:val="single" w:sz="4" w:space="0" w:color="808080"/>
+          <w:right w:val="single" w:sz="4" w:space="0" w:color="808080"/>
+          <w:insideH w:val="single" w:sz="4" w:space="0" w:color="808080"/>
+          <w:insideV w:val="single" w:sz="4" w:space="0" w:color="808080"/>
+        </w:tblBorders>
+      </w:tblPr>
+      <w:tblGrid>
+        <w:gridCol w:w="9354"/>
+      </w:tblGrid>
+      <w:tr>
+        <w:tc>
+          <w:tcPr>
+            <w:tcW w:type="dxa" w:w="9354"/>
+          </w:tcPr>
+          <w:p>
+            <w:pPr>
+              <w:spacing w:after="40"/>
+            </w:pPr>
+            <w:r>
+              <w:rPr>
+                <w:rFonts w:ascii="Comic Sans MS" w:hAnsi="Comic Sans MS"/>
+                <w:b w:val="0"/>
+                <w:sz w:val="20"/>
+              </w:rPr>
+              <w:t>NOTES:</w:t>
+            </w:r>
+          </w:p>
+          <w:p>
+            <w:pPr>
+              <w:spacing w:after="0"/>
+            </w:pPr>
+            <w:r>
+              <w:rPr>
+                <w:rFonts w:ascii="Comic Sans MS" w:hAnsi="Comic Sans MS"/>
+                <w:sz w:val="18"/>
+              </w:rPr>
+              <w:t>Create and edit share one form component so the two field sets cannot drift apart; the coordinates are grouped separately and labelled with what they are for.</w:t>
+            </w:r>
+          </w:p>
+        </w:tc>
+      </w:tr>
+    </w:tbl>
+    <w:p>
+      <w:pPr>
+        <w:spacing w:after="0"/>
+      </w:pPr>
     </w:p>
     <w:tbl>
       <w:tblPr>
@@ -1693,45 +3295,298 @@
         <w:t>Elements:</w:t>
       </w:r>
     </w:p>
-    <w:p>
-      <w:pPr>
-        <w:spacing w:after="120"/>
-        <w:jc w:val="center"/>
+    <w:tbl>
+      <w:tblPr>
+        <w:tblW w:type="auto" w:w="0"/>
+        <w:tblLook w:firstColumn="1" w:firstRow="1" w:lastColumn="0" w:lastRow="0" w:noHBand="0" w:noVBand="1" w:val="04A0"/>
+        <w:tblBorders>
+          <w:top w:val="single" w:sz="4" w:space="0" w:color="808080"/>
+          <w:left w:val="single" w:sz="4" w:space="0" w:color="808080"/>
+          <w:bottom w:val="single" w:sz="4" w:space="0" w:color="808080"/>
+          <w:right w:val="single" w:sz="4" w:space="0" w:color="808080"/>
+          <w:insideH w:val="single" w:sz="4" w:space="0" w:color="808080"/>
+          <w:insideV w:val="single" w:sz="4" w:space="0" w:color="808080"/>
+        </w:tblBorders>
+      </w:tblPr>
+      <w:tblGrid>
+        <w:gridCol w:w="9354"/>
+      </w:tblGrid>
+      <w:tr>
+        <w:tc>
+          <w:tcPr>
+            <w:tcW w:type="dxa" w:w="9354"/>
+          </w:tcPr>
+          <w:p>
+            <w:pPr>
+              <w:spacing w:after="40"/>
+            </w:pPr>
+            <w:r>
+              <w:rPr>
+                <w:rFonts w:ascii="Comic Sans MS" w:hAnsi="Comic Sans MS"/>
+                <w:b w:val="0"/>
+                <w:sz w:val="20"/>
+              </w:rPr>
+              <w:t>GRAPHICS:</w:t>
+            </w:r>
+          </w:p>
+          <w:p>
+            <w:pPr>
+              <w:spacing w:after="40"/>
+              <w:jc w:val="center"/>
+            </w:pPr>
+            <w:r>
+              <w:drawing>
+                <wp:inline xmlns:a="http://schemas.openxmlformats.org/drawingml/2006/main" xmlns:pic="http://schemas.openxmlformats.org/drawingml/2006/picture">
+                  <wp:extent cx="3780000" cy="3691406"/>
+                  <wp:docPr id="7" name="Picture 7"/>
+                  <wp:cNvGraphicFramePr>
+                    <a:graphicFrameLocks noChangeAspect="1"/>
+                  </wp:cNvGraphicFramePr>
+                  <a:graphic>
+                    <a:graphicData uri="http://schemas.openxmlformats.org/drawingml/2006/picture">
+                      <pic:pic>
+                        <pic:nvPicPr>
+                          <pic:cNvPr id="0" name="S7-admin-edit.png"/>
+                          <pic:cNvPicPr/>
+                        </pic:nvPicPr>
+                        <pic:blipFill>
+                          <a:blip r:embed="rId13"/>
+                          <a:stretch>
+                            <a:fillRect/>
+                          </a:stretch>
+                        </pic:blipFill>
+                        <pic:spPr>
+                          <a:xfrm>
+                            <a:off x="0" y="0"/>
+                            <a:ext cx="3780000" cy="3691406"/>
+                          </a:xfrm>
+                          <a:prstGeom prst="rect"/>
+                        </pic:spPr>
+                      </pic:pic>
+                    </a:graphicData>
+                  </a:graphic>
+                </wp:inline>
+              </w:drawing>
+            </w:r>
+          </w:p>
+          <w:p>
+            <w:pPr>
+              <w:spacing w:after="0"/>
+            </w:pPr>
+            <w:r>
+              <w:rPr>
+                <w:rFonts w:ascii="Comic Sans MS" w:hAnsi="Comic Sans MS"/>
+                <w:sz w:val="18"/>
+              </w:rPr>
+              <w:t>Live screenshot of the deployed page (https://24831941.it.scu.edu.au), taken with headless Chrome. The layout is the design; every value on it comes from the API.</w:t>
+            </w:r>
+          </w:p>
+        </w:tc>
+      </w:tr>
+    </w:tbl>
+    <w:p>
+      <w:pPr>
+        <w:spacing w:after="0"/>
+      </w:pPr>
+    </w:p>
+    <w:tbl>
+      <w:tblPr>
+        <w:tblW w:type="auto" w:w="0"/>
+        <w:tblLook w:firstColumn="1" w:firstRow="1" w:lastColumn="0" w:lastRow="0" w:noHBand="0" w:noVBand="1" w:val="04A0"/>
+        <w:tblBorders>
+          <w:top w:val="single" w:sz="4" w:space="0" w:color="808080"/>
+          <w:left w:val="single" w:sz="4" w:space="0" w:color="808080"/>
+          <w:bottom w:val="single" w:sz="4" w:space="0" w:color="808080"/>
+          <w:right w:val="single" w:sz="4" w:space="0" w:color="808080"/>
+          <w:insideH w:val="single" w:sz="4" w:space="0" w:color="808080"/>
+          <w:insideV w:val="single" w:sz="4" w:space="0" w:color="808080"/>
+        </w:tblBorders>
+      </w:tblPr>
+      <w:tblGrid>
+        <w:gridCol w:w="9354"/>
+      </w:tblGrid>
+      <w:tr>
+        <w:tc>
+          <w:tcPr>
+            <w:tcW w:type="dxa" w:w="9354"/>
+          </w:tcPr>
+          <w:p>
+            <w:pPr>
+              <w:spacing w:after="40"/>
+            </w:pPr>
+            <w:r>
+              <w:rPr>
+                <w:rFonts w:ascii="Comic Sans MS" w:hAnsi="Comic Sans MS"/>
+                <w:b w:val="0"/>
+                <w:sz w:val="20"/>
+              </w:rPr>
+              <w:t>TEXT:</w:t>
+            </w:r>
+          </w:p>
+          <w:p>
+            <w:pPr>
+              <w:spacing w:after="0"/>
+            </w:pPr>
+            <w:r>
+              <w:rPr>
+                <w:rFonts w:ascii="Comic Sans MS" w:hAnsi="Comic Sans MS"/>
+                <w:sz w:val="18"/>
+              </w:rPr>
+              <w:t>Same form as S6, pre-filled (screenshot: the Twilight 10K)</w:t>
+            </w:r>
+          </w:p>
+          <w:p>
+            <w:pPr>
+              <w:spacing w:after="0"/>
+            </w:pPr>
+            <w:r>
+              <w:rPr>
+                <w:rFonts w:ascii="Comic Sans MS" w:hAnsi="Comic Sans MS"/>
+                <w:sz w:val="18"/>
+              </w:rPr>
+              <w:t>Section 'Registrations for this event': booking count, total tickets, then each booking with name, email, phone, tickets and date</w:t>
+            </w:r>
+          </w:p>
+          <w:p>
+            <w:pPr>
+              <w:spacing w:after="0"/>
+            </w:pPr>
+            <w:r>
+              <w:rPr>
+                <w:rFonts w:ascii="Comic Sans MS" w:hAnsi="Comic Sans MS"/>
+                <w:sz w:val="18"/>
+              </w:rPr>
+              <w:t>The delete rule in the staff member's own screen: 'Because registrations exist, this event cannot be deleted - suspend it instead.'</w:t>
+            </w:r>
+          </w:p>
+        </w:tc>
+      </w:tr>
+    </w:tbl>
+    <w:p>
+      <w:pPr>
+        <w:spacing w:after="0"/>
+      </w:pPr>
+    </w:p>
+    <w:tbl>
+      <w:tblPr>
+        <w:tblW w:type="auto" w:w="0"/>
+        <w:tblLook w:firstColumn="1" w:firstRow="1" w:lastColumn="0" w:lastRow="0" w:noHBand="0" w:noVBand="1" w:val="04A0"/>
+        <w:tblBorders>
+          <w:top w:val="single" w:sz="4" w:space="0" w:color="808080"/>
+          <w:left w:val="single" w:sz="4" w:space="0" w:color="808080"/>
+          <w:bottom w:val="single" w:sz="4" w:space="0" w:color="808080"/>
+          <w:right w:val="single" w:sz="4" w:space="0" w:color="808080"/>
+          <w:insideH w:val="single" w:sz="4" w:space="0" w:color="808080"/>
+          <w:insideV w:val="single" w:sz="4" w:space="0" w:color="808080"/>
+        </w:tblBorders>
+      </w:tblPr>
+      <w:tblGrid>
+        <w:gridCol w:w="9354"/>
+      </w:tblGrid>
+      <w:tr>
+        <w:tc>
+          <w:tcPr>
+            <w:tcW w:type="dxa" w:w="9354"/>
+          </w:tcPr>
+          <w:p>
+            <w:pPr>
+              <w:spacing w:after="40"/>
+            </w:pPr>
+            <w:r>
+              <w:rPr>
+                <w:rFonts w:ascii="Comic Sans MS" w:hAnsi="Comic Sans MS"/>
+                <w:b w:val="0"/>
+                <w:sz w:val="20"/>
+              </w:rPr>
+              <w:t>AUDIO/VIDEO:</w:t>
+            </w:r>
+          </w:p>
+          <w:p>
+            <w:pPr>
+              <w:spacing w:after="0"/>
+            </w:pPr>
+            <w:r>
+              <w:rPr>
+                <w:rFonts w:ascii="Comic Sans MS" w:hAnsi="Comic Sans MS"/>
+                <w:sz w:val="18"/>
+              </w:rPr>
+              <w:t>None beyond the data itself - the registration list is part of the same API response as the event.</w:t>
+            </w:r>
+          </w:p>
+        </w:tc>
+      </w:tr>
+    </w:tbl>
+    <w:p>
+      <w:pPr>
+        <w:spacing w:after="0"/>
+      </w:pPr>
+    </w:p>
+    <w:p>
+      <w:pPr>
+        <w:spacing w:after="40"/>
       </w:pPr>
       <w:r>
-        <w:drawing>
-          <wp:inline xmlns:a="http://schemas.openxmlformats.org/drawingml/2006/main" xmlns:pic="http://schemas.openxmlformats.org/drawingml/2006/picture">
-            <wp:extent cx="4500000" cy="4394531"/>
-            <wp:docPr id="7" name="Picture 7"/>
-            <wp:cNvGraphicFramePr>
-              <a:graphicFrameLocks noChangeAspect="1"/>
-            </wp:cNvGraphicFramePr>
-            <a:graphic>
-              <a:graphicData uri="http://schemas.openxmlformats.org/drawingml/2006/picture">
-                <pic:pic>
-                  <pic:nvPicPr>
-                    <pic:cNvPr id="0" name="S7-admin-edit.png"/>
-                    <pic:cNvPicPr/>
-                  </pic:nvPicPr>
-                  <pic:blipFill>
-                    <a:blip r:embed="rId13"/>
-                    <a:stretch>
-                      <a:fillRect/>
-                    </a:stretch>
-                  </pic:blipFill>
-                  <pic:spPr>
-                    <a:xfrm>
-                      <a:off x="0" y="0"/>
-                      <a:ext cx="4500000" cy="4394531"/>
-                    </a:xfrm>
-                    <a:prstGeom prst="rect"/>
-                  </pic:spPr>
-                </pic:pic>
-              </a:graphicData>
-            </a:graphic>
-          </wp:inline>
-        </w:drawing>
+        <w:rPr>
+          <w:rFonts w:ascii="Comic Sans MS" w:hAnsi="Comic Sans MS" w:cs="Comic Sans MS"/>
+          <w:b/>
+          <w:sz w:val="28"/>
+        </w:rPr>
+        <w:t>NOTES</w:t>
       </w:r>
+    </w:p>
+    <w:tbl>
+      <w:tblPr>
+        <w:tblW w:type="auto" w:w="0"/>
+        <w:tblLook w:firstColumn="1" w:firstRow="1" w:lastColumn="0" w:lastRow="0" w:noHBand="0" w:noVBand="1" w:val="04A0"/>
+        <w:tblBorders>
+          <w:top w:val="single" w:sz="4" w:space="0" w:color="808080"/>
+          <w:left w:val="single" w:sz="4" w:space="0" w:color="808080"/>
+          <w:bottom w:val="single" w:sz="4" w:space="0" w:color="808080"/>
+          <w:right w:val="single" w:sz="4" w:space="0" w:color="808080"/>
+          <w:insideH w:val="single" w:sz="4" w:space="0" w:color="808080"/>
+          <w:insideV w:val="single" w:sz="4" w:space="0" w:color="808080"/>
+        </w:tblBorders>
+      </w:tblPr>
+      <w:tblGrid>
+        <w:gridCol w:w="9354"/>
+      </w:tblGrid>
+      <w:tr>
+        <w:tc>
+          <w:tcPr>
+            <w:tcW w:type="dxa" w:w="9354"/>
+          </w:tcPr>
+          <w:p>
+            <w:pPr>
+              <w:spacing w:after="40"/>
+            </w:pPr>
+            <w:r>
+              <w:rPr>
+                <w:rFonts w:ascii="Comic Sans MS" w:hAnsi="Comic Sans MS"/>
+                <w:b w:val="0"/>
+                <w:sz w:val="20"/>
+              </w:rPr>
+              <w:t>NOTES:</w:t>
+            </w:r>
+          </w:p>
+          <w:p>
+            <w:pPr>
+              <w:spacing w:after="0"/>
+            </w:pPr>
+            <w:r>
+              <w:rPr>
+                <w:rFonts w:ascii="Comic Sans MS" w:hAnsi="Comic Sans MS"/>
+                <w:sz w:val="18"/>
+              </w:rPr>
+              <w:t>Form and registrations on one screen: the staff member sees who a change affects while making it.</w:t>
+            </w:r>
+          </w:p>
+        </w:tc>
+      </w:tr>
+    </w:tbl>
+    <w:p>
+      <w:pPr>
+        <w:spacing w:after="0"/>
+      </w:pPr>
     </w:p>
     <w:tbl>
       <w:tblPr>

</xml_diff>